<commit_message>
Adding scripts for gathering statistics
</commit_message>
<xml_diff>
--- a/output files description.docx
+++ b/output files description.docx
@@ -1617,25 +1617,7 @@
         <w:rPr>
           <w:lang w:val="en-US"/>
         </w:rPr>
-        <w:t xml:space="preserve">means </w:t>
-      </w:r>
-      <w:r>
-        <w:rPr>
-          <w:lang w:val="en-US"/>
-        </w:rPr>
-        <w:t xml:space="preserve">how many times this task was launched. If </w:t>
-      </w:r>
-      <w:r>
-        <w:rPr>
-          <w:lang w:val="en-US"/>
-        </w:rPr>
-        <w:t>running</w:t>
-      </w:r>
-      <w:r>
-        <w:rPr>
-          <w:lang w:val="en-US"/>
-        </w:rPr>
-        <w:t xml:space="preserve"> the task lasts less than 1 second, the benchmark continues to launch it until the total test time will reach 1 second.</w:t>
+        <w:t>means how many times this task was launched. If running the task lasts less than 1 second, the benchmark continues to launch it until the total test time will reach 1 second.</w:t>
       </w:r>
     </w:p>
     <w:p>
@@ -2483,19 +2465,7 @@
         <w:rPr>
           <w:lang w:val="en-US"/>
         </w:rPr>
-        <w:t xml:space="preserve">how many times this task was launched. If </w:t>
-      </w:r>
-      <w:r>
-        <w:rPr>
-          <w:lang w:val="en-US"/>
-        </w:rPr>
-        <w:t>running</w:t>
-      </w:r>
-      <w:r>
-        <w:rPr>
-          <w:lang w:val="en-US"/>
-        </w:rPr>
-        <w:t xml:space="preserve"> the task lasts less than 1 second, the benchmark continues to launch it until the total test time will reach 1 second.</w:t>
+        <w:t>how many times this task was launched. If running the task lasts less than 1 second, the benchmark continues to launch it until the total test time will reach 1 second.</w:t>
       </w:r>
     </w:p>
     <w:p>
@@ -3381,41 +3351,21 @@
         <w:rPr>
           <w:lang w:val="en-US"/>
         </w:rPr>
-        <w:t xml:space="preserve">how many times this task was launched. If </w:t>
-      </w:r>
-      <w:r>
-        <w:rPr>
-          <w:lang w:val="en-US"/>
-        </w:rPr>
-        <w:t>running</w:t>
-      </w:r>
-      <w:r>
-        <w:rPr>
-          <w:lang w:val="en-US"/>
-        </w:rPr>
-        <w:t xml:space="preserve"> the task lasts less than 1 second, the benchmark continues to launch it until the total test time will reach 1 second.</w:t>
-      </w:r>
-    </w:p>
-    <w:p>
-      <w:pPr>
-        <w:rPr>
-          <w:lang w:val="en-US"/>
-        </w:rPr>
-      </w:pPr>
-    </w:p>
-    <w:p>
-      <w:pPr>
-        <w:rPr>
-          <w:lang w:val="en-US"/>
-        </w:rPr>
-      </w:pPr>
-      <w:r>
-        <w:rPr>
-          <w:b/>
-          <w:bCs/>
-          <w:lang w:val="en-US"/>
-        </w:rPr>
-        <w:lastRenderedPageBreak/>
+        <w:t>how many times this task was launched. If running the task lasts less than 1 second, the benchmark continues to launch it until the total test time will reach 1 second.</w:t>
+      </w:r>
+    </w:p>
+    <w:p>
+      <w:pPr>
+        <w:rPr>
+          <w:lang w:val="en-US"/>
+        </w:rPr>
+      </w:pPr>
+      <w:r>
+        <w:rPr>
+          <w:b/>
+          <w:bCs/>
+          <w:lang w:val="en-US"/>
+        </w:rPr>
         <w:t>8</w:t>
       </w:r>
       <w:r>

</xml_diff>